<commit_message>
Ispravka SSU-ova 6-10 nakon formalne inspekcije
Change-Id: I4c16b0b9887a7bc181af2822016581a3c6ba5327
</commit_message>
<xml_diff>
--- a/faza2/ssu/SSU6_Upravljanje_trkackim_dogadjajima.docx
+++ b/faza2/ssu/SSU6_Upravljanje_trkackim_dogadjajima.docx
@@ -1,6 +1,6 @@
 
 <file path=word/document.xml><?xml version="1.0" encoding="utf-8"?>
-<w:document xmlns:wpc="http://schemas.microsoft.com/office/word/2010/wordprocessingCanvas" xmlns:cx="http://schemas.microsoft.com/office/drawing/2014/chartex" xmlns:cx1="http://schemas.microsoft.com/office/drawing/2015/9/8/chartex" xmlns:cx2="http://schemas.microsoft.com/office/drawing/2015/10/21/chartex" xmlns:cx3="http://schemas.microsoft.com/office/drawing/2016/5/9/chartex" xmlns:cx4="http://schemas.microsoft.com/office/drawing/2016/5/10/chartex" xmlns:cx5="http://schemas.microsoft.com/office/drawing/2016/5/11/chartex" xmlns:cx6="http://schemas.microsoft.com/office/drawing/2016/5/12/chartex" xmlns:cx7="http://schemas.microsoft.com/office/drawing/2016/5/13/chartex" xmlns:cx8="http://schemas.microsoft.com/office/drawing/2016/5/14/chartex" xmlns:mc="http://schemas.openxmlformats.org/markup-compatibility/2006" xmlns:aink="http://schemas.microsoft.com/office/drawing/2016/ink" xmlns:am3d="http://schemas.microsoft.com/office/drawing/2017/model3d" xmlns:o="urn:schemas-microsoft-com:office:office" xmlns:oel="http://schemas.microsoft.com/office/2019/extlst" xmlns:r="http://schemas.openxmlformats.org/officeDocument/2006/relationships" xmlns:m="http://schemas.openxmlformats.org/officeDocument/2006/math" xmlns:v="urn:schemas-microsoft-com:vml" xmlns:wp14="http://schemas.microsoft.com/office/word/2010/wordprocessingDrawing" xmlns:wp="http://schemas.openxmlformats.org/drawingml/2006/wordprocessingDrawing" xmlns:w10="urn:schemas-microsoft-com:office:word" xmlns:w="http://schemas.openxmlformats.org/wordprocessingml/2006/main" xmlns:w14="http://schemas.microsoft.com/office/word/2010/wordml" xmlns:w15="http://schemas.microsoft.com/office/word/2012/wordml" xmlns:w16cex="http://schemas.microsoft.com/office/word/2018/wordml/cex" xmlns:w16cid="http://schemas.microsoft.com/office/word/2016/wordml/cid" xmlns:w16="http://schemas.microsoft.com/office/word/2018/wordml" xmlns:w16du="http://schemas.microsoft.com/office/word/2023/wordml/word16du" xmlns:w16sdtdh="http://schemas.microsoft.com/office/word/2020/wordml/sdtdatahash" xmlns:w16sdtfl="http://schemas.microsoft.com/office/word/2024/wordml/sdtformatlock" xmlns:w16se="http://schemas.microsoft.com/office/word/2015/wordml/symex" xmlns:wpg="http://schemas.microsoft.com/office/word/2010/wordprocessingGroup" xmlns:wpi="http://schemas.microsoft.com/office/word/2010/wordprocessingInk" xmlns:wne="http://schemas.microsoft.com/office/word/2006/wordml" xmlns:wps="http://schemas.microsoft.com/office/word/2010/wordprocessingShape" mc:Ignorable="w14 w15 w16se w16cid w16 w16cex w16sdtdh w16sdtfl w16du wp14">
+<w:document xmlns:wpc="http://schemas.microsoft.com/office/word/2010/wordprocessingCanvas" xmlns:cx="http://schemas.microsoft.com/office/drawing/2014/chartex" xmlns:cx1="http://schemas.microsoft.com/office/drawing/2015/9/8/chartex" xmlns:cx2="http://schemas.microsoft.com/office/drawing/2015/10/21/chartex" xmlns:cx3="http://schemas.microsoft.com/office/drawing/2016/5/9/chartex" xmlns:cx4="http://schemas.microsoft.com/office/drawing/2016/5/10/chartex" xmlns:cx5="http://schemas.microsoft.com/office/drawing/2016/5/11/chartex" xmlns:cx6="http://schemas.microsoft.com/office/drawing/2016/5/12/chartex" xmlns:cx7="http://schemas.microsoft.com/office/drawing/2016/5/13/chartex" xmlns:cx8="http://schemas.microsoft.com/office/drawing/2016/5/14/chartex" xmlns:mc="http://schemas.openxmlformats.org/markup-compatibility/2006" xmlns:aink="http://schemas.microsoft.com/office/drawing/2016/ink" xmlns:am3d="http://schemas.microsoft.com/office/drawing/2017/model3d" xmlns:o="urn:schemas-microsoft-com:office:office" xmlns:r="http://schemas.openxmlformats.org/officeDocument/2006/relationships" xmlns:m="http://schemas.openxmlformats.org/officeDocument/2006/math" xmlns:v="urn:schemas-microsoft-com:vml" xmlns:wp14="http://schemas.microsoft.com/office/word/2010/wordprocessingDrawing" xmlns:wp="http://schemas.openxmlformats.org/drawingml/2006/wordprocessingDrawing" xmlns:w10="urn:schemas-microsoft-com:office:word" xmlns:w="http://schemas.openxmlformats.org/wordprocessingml/2006/main" xmlns:w14="http://schemas.microsoft.com/office/word/2010/wordml" xmlns:w15="http://schemas.microsoft.com/office/word/2012/wordml" xmlns:w16cex="http://schemas.microsoft.com/office/word/2018/wordml/cex" xmlns:w16cid="http://schemas.microsoft.com/office/word/2016/wordml/cid" xmlns:w16="http://schemas.microsoft.com/office/word/2018/wordml" xmlns:w16sdtdh="http://schemas.microsoft.com/office/word/2020/wordml/sdtdatahash" xmlns:w16se="http://schemas.microsoft.com/office/word/2015/wordml/symex" xmlns:wpg="http://schemas.microsoft.com/office/word/2010/wordprocessingGroup" xmlns:wpi="http://schemas.microsoft.com/office/word/2010/wordprocessingInk" xmlns:wne="http://schemas.microsoft.com/office/word/2006/wordml" xmlns:wps="http://schemas.microsoft.com/office/word/2010/wordprocessingShape" mc:Ignorable="w14 w15 w16se w16cid w16 w16cex w16sdtdh wp14">
   <w:body>
     <w:p>
       <w:pPr>
@@ -193,6 +193,11 @@
             <w:tcW w:w="2196" w:type="dxa"/>
           </w:tcPr>
           <w:p>
+            <w:pPr>
+              <w:rPr>
+                <w:sz w:val="22"/>
+              </w:rPr>
+            </w:pPr>
             <w:r>
               <w:rPr>
                 <w:sz w:val="22"/>
@@ -202,12 +207,101 @@
           </w:p>
         </w:tc>
       </w:tr>
+      <w:tr>
+        <w:tc>
+          <w:tcPr>
+            <w:tcW w:w="2196" w:type="dxa"/>
+          </w:tcPr>
+          <w:p>
+            <w:pPr>
+              <w:rPr>
+                <w:sz w:val="22"/>
+              </w:rPr>
+            </w:pPr>
+            <w:r>
+              <w:rPr>
+                <w:sz w:val="22"/>
+              </w:rPr>
+              <w:t>14.05.2026.</w:t>
+            </w:r>
+          </w:p>
+        </w:tc>
+        <w:tc>
+          <w:tcPr>
+            <w:tcW w:w="2196" w:type="dxa"/>
+          </w:tcPr>
+          <w:p>
+            <w:pPr>
+              <w:rPr>
+                <w:sz w:val="22"/>
+              </w:rPr>
+            </w:pPr>
+            <w:r>
+              <w:rPr>
+                <w:sz w:val="22"/>
+              </w:rPr>
+              <w:t>1.1</w:t>
+            </w:r>
+          </w:p>
+        </w:tc>
+        <w:tc>
+          <w:tcPr>
+            <w:tcW w:w="2196" w:type="dxa"/>
+          </w:tcPr>
+          <w:p>
+            <w:pPr>
+              <w:rPr>
+                <w:sz w:val="22"/>
+              </w:rPr>
+            </w:pPr>
+            <w:r>
+              <w:rPr>
+                <w:sz w:val="22"/>
+              </w:rPr>
+              <w:t>Ispravka nakon FR</w:t>
+            </w:r>
+          </w:p>
+        </w:tc>
+        <w:tc>
+          <w:tcPr>
+            <w:tcW w:w="2196" w:type="dxa"/>
+          </w:tcPr>
+          <w:p>
+            <w:pPr>
+              <w:rPr>
+                <w:sz w:val="22"/>
+                <w:lang w:val="sr-Latn-RS"/>
+              </w:rPr>
+            </w:pPr>
+            <w:r>
+              <w:rPr>
+                <w:sz w:val="22"/>
+              </w:rPr>
+              <w:t>Marko Mandi</w:t>
+            </w:r>
+            <w:r>
+              <w:rPr>
+                <w:sz w:val="22"/>
+                <w:lang w:val="sr-Latn-RS"/>
+              </w:rPr>
+              <w:t>ć</w:t>
+            </w:r>
+          </w:p>
+        </w:tc>
+      </w:tr>
     </w:tbl>
     <w:p/>
     <w:p>
       <w:pPr>
         <w:pStyle w:val="Heading2"/>
       </w:pPr>
+      <w:r>
+        <w:rPr>
+          <w:rFonts w:ascii="Times New Roman" w:hAnsi="Times New Roman"/>
+          <w:sz w:val="28"/>
+        </w:rPr>
+        <w:t xml:space="preserve">1. </w:t>
+      </w:r>
       <w:r>
         <w:rPr>
           <w:rFonts w:ascii="Times New Roman" w:hAnsi="Times New Roman"/>
@@ -301,6 +395,13 @@
       <w:pPr>
         <w:pStyle w:val="Heading2"/>
       </w:pPr>
+      <w:r>
+        <w:rPr>
+          <w:rFonts w:ascii="Times New Roman" w:hAnsi="Times New Roman"/>
+          <w:sz w:val="28"/>
+        </w:rPr>
+        <w:t xml:space="preserve">2. </w:t>
+      </w:r>
       <w:r>
         <w:rPr>
           <w:rFonts w:ascii="Times New Roman" w:hAnsi="Times New Roman"/>
@@ -428,18 +529,29 @@
     <w:p>
       <w:pPr>
         <w:pStyle w:val="Heading4"/>
+        <w:numPr>
+          <w:ilvl w:val="2"/>
+          <w:numId w:val="10"/>
+        </w:numPr>
       </w:pPr>
       <w:r>
         <w:rPr>
           <w:rFonts w:ascii="Times New Roman" w:hAnsi="Times New Roman"/>
         </w:rPr>
-        <w:t>2.2.2 Organizator unosi nevalidne podatke za cenu ili kapacitet (Alternativni scenario)</w:t>
+        <w:t>Organizator unosi nevalidne podatke za cenu ili kapacitet (Alternativni scenario)</w:t>
       </w:r>
     </w:p>
     <w:p>
       <w:pPr>
         <w:pStyle w:val="ListNumber"/>
-      </w:pPr>
+        <w:numPr>
+          <w:ilvl w:val="0"/>
+          <w:numId w:val="0"/>
+        </w:numPr>
+      </w:pPr>
+      <w:r>
+        <w:t xml:space="preserve">5. </w:t>
+      </w:r>
       <w:r>
         <w:t>Akcije od 1 do 4 su iste kao u scenariju 2.2.1.</w:t>
       </w:r>
@@ -447,7 +559,14 @@
     <w:p>
       <w:pPr>
         <w:pStyle w:val="ListNumber"/>
-      </w:pPr>
+        <w:numPr>
+          <w:ilvl w:val="0"/>
+          <w:numId w:val="0"/>
+        </w:numPr>
+      </w:pPr>
+      <w:r>
+        <w:t xml:space="preserve">6. </w:t>
+      </w:r>
       <w:r>
         <w:t>Organizator unosi negativnu cenu karte ili slova umesto brojeva za broj mesta.</w:t>
       </w:r>
@@ -455,6 +574,10 @@
     <w:p>
       <w:pPr>
         <w:pStyle w:val="ListNumber"/>
+        <w:numPr>
+          <w:ilvl w:val="0"/>
+          <w:numId w:val="11"/>
+        </w:numPr>
       </w:pPr>
       <w:r>
         <w:t>Organizator klikne na dugme za čuvanje podešavanja.</w:t>
@@ -475,6 +598,396 @@
       <w:r>
         <w:t>Sistem prikazuje poruku greške ispod problematičnog polja, na primer „Cena mora biti pozitivan broj" ili „Kapacitet mora sadržati samo cifre".</w:t>
       </w:r>
+    </w:p>
+    <w:p>
+      <w:pPr>
+        <w:pStyle w:val="ListNumber"/>
+        <w:numPr>
+          <w:ilvl w:val="0"/>
+          <w:numId w:val="0"/>
+        </w:numPr>
+        <w:ind w:left="360" w:hanging="360"/>
+      </w:pPr>
+    </w:p>
+    <w:p>
+      <w:pPr>
+        <w:pStyle w:val="Heading4"/>
+        <w:numPr>
+          <w:ilvl w:val="2"/>
+          <w:numId w:val="10"/>
+        </w:numPr>
+      </w:pPr>
+      <w:r>
+        <w:rPr>
+          <w:rFonts w:ascii="Times New Roman" w:hAnsi="Times New Roman"/>
+        </w:rPr>
+        <w:t>Organizator uspešno menja podatke o trkačkom događaju (Glavni scenario)</w:t>
+      </w:r>
+    </w:p>
+    <w:p>
+      <w:pPr>
+        <w:pStyle w:val="ListNumber"/>
+        <w:numPr>
+          <w:ilvl w:val="0"/>
+          <w:numId w:val="12"/>
+        </w:numPr>
+      </w:pPr>
+      <w:r>
+        <w:t>Organizator se prijavljuje na platformu i otvara listu svojih preuzeting događaja.</w:t>
+      </w:r>
+    </w:p>
+    <w:p>
+      <w:pPr>
+        <w:pStyle w:val="ListNumber"/>
+        <w:numPr>
+          <w:ilvl w:val="0"/>
+          <w:numId w:val="12"/>
+        </w:numPr>
+      </w:pPr>
+      <w:r>
+        <w:t>Sistem prikazuje listu događaja kojima organizator upravlja.</w:t>
+      </w:r>
+    </w:p>
+    <w:p>
+      <w:pPr>
+        <w:pStyle w:val="ListNumber"/>
+        <w:numPr>
+          <w:ilvl w:val="0"/>
+          <w:numId w:val="12"/>
+        </w:numPr>
+      </w:pPr>
+      <w:r>
+        <w:t>Organizator bira događaj koji želi da izmeni i klikne na dugme „Izmeni".</w:t>
+      </w:r>
+    </w:p>
+    <w:p>
+      <w:pPr>
+        <w:pStyle w:val="ListNumber"/>
+        <w:numPr>
+          <w:ilvl w:val="0"/>
+          <w:numId w:val="12"/>
+        </w:numPr>
+      </w:pPr>
+      <w:r>
+        <w:t>Sistem prikazuje formu sa trenutno unetim podacima o događaju.</w:t>
+      </w:r>
+    </w:p>
+    <w:p>
+      <w:pPr>
+        <w:pStyle w:val="ListNumber"/>
+        <w:numPr>
+          <w:ilvl w:val="0"/>
+          <w:numId w:val="12"/>
+        </w:numPr>
+      </w:pPr>
+      <w:r>
+        <w:t>Organizator menja željene podatke, na primer cenu karata, broj mesta ili naziv sektora.</w:t>
+      </w:r>
+    </w:p>
+    <w:p>
+      <w:pPr>
+        <w:pStyle w:val="ListNumber"/>
+        <w:numPr>
+          <w:ilvl w:val="0"/>
+          <w:numId w:val="12"/>
+        </w:numPr>
+      </w:pPr>
+      <w:r>
+        <w:t>Organizator klikne na dugme za čuvanje izmena.</w:t>
+      </w:r>
+    </w:p>
+    <w:p>
+      <w:pPr>
+        <w:pStyle w:val="ListNumber"/>
+        <w:numPr>
+          <w:ilvl w:val="0"/>
+          <w:numId w:val="12"/>
+        </w:numPr>
+      </w:pPr>
+      <w:r>
+        <w:t>Sistem validira nove podatke i ažurira informacije u bazi podataka.</w:t>
+      </w:r>
+    </w:p>
+    <w:p>
+      <w:pPr>
+        <w:pStyle w:val="ListNumber"/>
+        <w:numPr>
+          <w:ilvl w:val="0"/>
+          <w:numId w:val="12"/>
+        </w:numPr>
+      </w:pPr>
+      <w:r>
+        <w:t>Sistem prikazuje poruku da su izmene uspešno sačuvane.</w:t>
+      </w:r>
+    </w:p>
+    <w:p>
+      <w:pPr>
+        <w:pStyle w:val="Heading4"/>
+      </w:pPr>
+      <w:r>
+        <w:rPr>
+          <w:rFonts w:ascii="Times New Roman" w:hAnsi="Times New Roman"/>
+        </w:rPr>
+        <w:t>2.2.4 Organizator pokušava da menja podatke događaja koji već ima prodatih karata (Alternativni scenario)</w:t>
+      </w:r>
+    </w:p>
+    <w:p>
+      <w:pPr>
+        <w:pStyle w:val="ListNumber"/>
+        <w:numPr>
+          <w:ilvl w:val="0"/>
+          <w:numId w:val="13"/>
+        </w:numPr>
+      </w:pPr>
+      <w:r>
+        <w:t>Akcije od 1 do 4 su iste kao u scenariju 2.2.3.</w:t>
+      </w:r>
+    </w:p>
+    <w:p>
+      <w:pPr>
+        <w:pStyle w:val="ListNumber"/>
+        <w:numPr>
+          <w:ilvl w:val="0"/>
+          <w:numId w:val="13"/>
+        </w:numPr>
+      </w:pPr>
+      <w:r>
+        <w:t>Organizator pokušava da smanji broj mesta ispod broja već prodatih karata.</w:t>
+      </w:r>
+    </w:p>
+    <w:p>
+      <w:pPr>
+        <w:pStyle w:val="ListNumber"/>
+        <w:numPr>
+          <w:ilvl w:val="0"/>
+          <w:numId w:val="13"/>
+        </w:numPr>
+      </w:pPr>
+      <w:r>
+        <w:t>Organizator klikne na dugme za čuvanje izmena.</w:t>
+      </w:r>
+    </w:p>
+    <w:p>
+      <w:pPr>
+        <w:pStyle w:val="ListNumber"/>
+        <w:numPr>
+          <w:ilvl w:val="0"/>
+          <w:numId w:val="13"/>
+        </w:numPr>
+      </w:pPr>
+      <w:r>
+        <w:t>Sistem prepoznaje konflikt i ne dozvoljava izmenu.</w:t>
+      </w:r>
+    </w:p>
+    <w:p>
+      <w:pPr>
+        <w:pStyle w:val="ListNumber"/>
+        <w:numPr>
+          <w:ilvl w:val="0"/>
+          <w:numId w:val="13"/>
+        </w:numPr>
+      </w:pPr>
+      <w:r>
+        <w:t>Sistem prikazuje poruku greške, na primer „Nije moguće smanjiti kapacitet ispod broja već prodatih karata".</w:t>
+      </w:r>
+    </w:p>
+    <w:p>
+      <w:pPr>
+        <w:pStyle w:val="Heading4"/>
+        <w:numPr>
+          <w:ilvl w:val="2"/>
+          <w:numId w:val="10"/>
+        </w:numPr>
+      </w:pPr>
+      <w:r>
+        <w:rPr>
+          <w:rFonts w:ascii="Times New Roman" w:hAnsi="Times New Roman"/>
+        </w:rPr>
+        <w:lastRenderedPageBreak/>
+        <w:t>Organizator uspešno otkazuje trkački događaj (Glavni scenario)</w:t>
+      </w:r>
+    </w:p>
+    <w:p>
+      <w:pPr>
+        <w:pStyle w:val="ListNumber"/>
+        <w:numPr>
+          <w:ilvl w:val="0"/>
+          <w:numId w:val="14"/>
+        </w:numPr>
+      </w:pPr>
+      <w:r>
+        <w:t>Organizator se prijavljuje na platformu i otvara listu svojih preuzetih događaja.</w:t>
+      </w:r>
+    </w:p>
+    <w:p>
+      <w:pPr>
+        <w:pStyle w:val="ListNumber"/>
+        <w:numPr>
+          <w:ilvl w:val="0"/>
+          <w:numId w:val="14"/>
+        </w:numPr>
+      </w:pPr>
+      <w:r>
+        <w:t>Sistem prikazuje listu događaja kojima organizator upravlja.</w:t>
+      </w:r>
+    </w:p>
+    <w:p>
+      <w:pPr>
+        <w:pStyle w:val="ListNumber"/>
+        <w:numPr>
+          <w:ilvl w:val="0"/>
+          <w:numId w:val="14"/>
+        </w:numPr>
+      </w:pPr>
+      <w:r>
+        <w:t>Organizator bira događaj koji želi da otkaže i klikne na dugme „Otkaži događaj".</w:t>
+      </w:r>
+    </w:p>
+    <w:p>
+      <w:pPr>
+        <w:pStyle w:val="ListNumber"/>
+        <w:numPr>
+          <w:ilvl w:val="0"/>
+          <w:numId w:val="14"/>
+        </w:numPr>
+      </w:pPr>
+      <w:r>
+        <w:t>Sistem prikazuje dijalog za potvrdu sa porukom „Da li ste sigurni da želite da  otkažete ovaj događaj?".</w:t>
+      </w:r>
+    </w:p>
+    <w:p>
+      <w:pPr>
+        <w:pStyle w:val="ListNumber"/>
+        <w:numPr>
+          <w:ilvl w:val="0"/>
+          <w:numId w:val="14"/>
+        </w:numPr>
+      </w:pPr>
+      <w:r>
+        <w:t>Organizator potvrđuje otkazivanje.</w:t>
+      </w:r>
+    </w:p>
+    <w:p>
+      <w:pPr>
+        <w:pStyle w:val="ListNumber"/>
+        <w:numPr>
+          <w:ilvl w:val="0"/>
+          <w:numId w:val="14"/>
+        </w:numPr>
+      </w:pPr>
+      <w:r>
+        <w:t>Sistem menja status događaja na „Otkazan" i uklanja ga sa liste dostupnih događaja.</w:t>
+      </w:r>
+    </w:p>
+    <w:p>
+      <w:pPr>
+        <w:pStyle w:val="ListNumber"/>
+        <w:numPr>
+          <w:ilvl w:val="0"/>
+          <w:numId w:val="14"/>
+        </w:numPr>
+      </w:pPr>
+      <w:r>
+        <w:t>Sistem prikazuje poruku da je događaj uspešno otkazan.</w:t>
+      </w:r>
+    </w:p>
+    <w:p>
+      <w:pPr>
+        <w:pStyle w:val="Heading4"/>
+        <w:numPr>
+          <w:ilvl w:val="2"/>
+          <w:numId w:val="10"/>
+        </w:numPr>
+      </w:pPr>
+      <w:r>
+        <w:rPr>
+          <w:rFonts w:ascii="Times New Roman" w:hAnsi="Times New Roman"/>
+        </w:rPr>
+        <w:t>Organizator otkazuje događaj koji već ima prodatih karata (Alternativni scenario)</w:t>
+      </w:r>
+    </w:p>
+    <w:p>
+      <w:pPr>
+        <w:pStyle w:val="ListNumber"/>
+        <w:numPr>
+          <w:ilvl w:val="0"/>
+          <w:numId w:val="0"/>
+        </w:numPr>
+        <w:ind w:left="360"/>
+      </w:pPr>
+      <w:r>
+        <w:t>5. Akcije od 1 do 4 su iste kao u scenariju 2.2.5.</w:t>
+      </w:r>
+    </w:p>
+    <w:p>
+      <w:pPr>
+        <w:pStyle w:val="ListNumber"/>
+        <w:numPr>
+          <w:ilvl w:val="0"/>
+          <w:numId w:val="15"/>
+        </w:numPr>
+      </w:pPr>
+      <w:r>
+        <w:t>Organizator potvrđuje otkazivanje događaja koji ima prodatih karata.</w:t>
+      </w:r>
+    </w:p>
+    <w:p>
+      <w:pPr>
+        <w:pStyle w:val="ListNumber"/>
+        <w:numPr>
+          <w:ilvl w:val="0"/>
+          <w:numId w:val="15"/>
+        </w:numPr>
+      </w:pPr>
+      <w:r>
+        <w:t>Sistem detektuje da postoje kupci sa važećim kartama za taj događaj.</w:t>
+      </w:r>
+    </w:p>
+    <w:p>
+      <w:pPr>
+        <w:pStyle w:val="ListNumber"/>
+        <w:numPr>
+          <w:ilvl w:val="0"/>
+          <w:numId w:val="15"/>
+        </w:numPr>
+      </w:pPr>
+      <w:r>
+        <w:t>Sistem pokreće proces povraćaja sredstava za sve prodane karte.</w:t>
+      </w:r>
+    </w:p>
+    <w:p>
+      <w:pPr>
+        <w:pStyle w:val="ListNumber"/>
+        <w:numPr>
+          <w:ilvl w:val="0"/>
+          <w:numId w:val="15"/>
+        </w:numPr>
+      </w:pPr>
+      <w:r>
+        <w:t>Sistem obaveštava kupce o otkazivanju događaja putem e-mail poruke.</w:t>
+      </w:r>
+    </w:p>
+    <w:p>
+      <w:pPr>
+        <w:pStyle w:val="ListNumber"/>
+        <w:numPr>
+          <w:ilvl w:val="0"/>
+          <w:numId w:val="15"/>
+        </w:numPr>
+      </w:pPr>
+      <w:r>
+        <w:t>Sistem menja status događaja na „Otkazan" i uklanja ga sa platforme.</w:t>
+      </w:r>
+    </w:p>
+    <w:p>
+      <w:pPr>
+        <w:pStyle w:val="ListNumber"/>
+        <w:numPr>
+          <w:ilvl w:val="0"/>
+          <w:numId w:val="0"/>
+        </w:numPr>
+        <w:ind w:left="360" w:hanging="360"/>
+      </w:pPr>
     </w:p>
     <w:p>
       <w:pPr>
@@ -571,7 +1084,7 @@
 </file>
 
 <file path=word/numbering.xml><?xml version="1.0" encoding="utf-8"?>
-<w:numbering xmlns:wpc="http://schemas.microsoft.com/office/word/2010/wordprocessingCanvas" xmlns:cx="http://schemas.microsoft.com/office/drawing/2014/chartex" xmlns:cx1="http://schemas.microsoft.com/office/drawing/2015/9/8/chartex" xmlns:cx2="http://schemas.microsoft.com/office/drawing/2015/10/21/chartex" xmlns:cx3="http://schemas.microsoft.com/office/drawing/2016/5/9/chartex" xmlns:cx4="http://schemas.microsoft.com/office/drawing/2016/5/10/chartex" xmlns:cx5="http://schemas.microsoft.com/office/drawing/2016/5/11/chartex" xmlns:cx6="http://schemas.microsoft.com/office/drawing/2016/5/12/chartex" xmlns:cx7="http://schemas.microsoft.com/office/drawing/2016/5/13/chartex" xmlns:cx8="http://schemas.microsoft.com/office/drawing/2016/5/14/chartex" xmlns:mc="http://schemas.openxmlformats.org/markup-compatibility/2006" xmlns:aink="http://schemas.microsoft.com/office/drawing/2016/ink" xmlns:am3d="http://schemas.microsoft.com/office/drawing/2017/model3d" xmlns:o="urn:schemas-microsoft-com:office:office" xmlns:oel="http://schemas.microsoft.com/office/2019/extlst" xmlns:r="http://schemas.openxmlformats.org/officeDocument/2006/relationships" xmlns:m="http://schemas.openxmlformats.org/officeDocument/2006/math" xmlns:v="urn:schemas-microsoft-com:vml" xmlns:wp14="http://schemas.microsoft.com/office/word/2010/wordprocessingDrawing" xmlns:wp="http://schemas.openxmlformats.org/drawingml/2006/wordprocessingDrawing" xmlns:w10="urn:schemas-microsoft-com:office:word" xmlns:w="http://schemas.openxmlformats.org/wordprocessingml/2006/main" xmlns:w14="http://schemas.microsoft.com/office/word/2010/wordml" xmlns:w15="http://schemas.microsoft.com/office/word/2012/wordml" xmlns:w16cex="http://schemas.microsoft.com/office/word/2018/wordml/cex" xmlns:w16cid="http://schemas.microsoft.com/office/word/2016/wordml/cid" xmlns:w16="http://schemas.microsoft.com/office/word/2018/wordml" xmlns:w16du="http://schemas.microsoft.com/office/word/2023/wordml/word16du" xmlns:w16sdtdh="http://schemas.microsoft.com/office/word/2020/wordml/sdtdatahash" xmlns:w16sdtfl="http://schemas.microsoft.com/office/word/2024/wordml/sdtformatlock" xmlns:w16se="http://schemas.microsoft.com/office/word/2015/wordml/symex" xmlns:wpg="http://schemas.microsoft.com/office/word/2010/wordprocessingGroup" xmlns:wpi="http://schemas.microsoft.com/office/word/2010/wordprocessingInk" xmlns:wne="http://schemas.microsoft.com/office/word/2006/wordml" xmlns:wps="http://schemas.microsoft.com/office/word/2010/wordprocessingShape" mc:Ignorable="w14 w15 w16se w16cid w16 w16cex w16sdtdh w16sdtfl w16du wp14">
+<w:numbering xmlns:wpc="http://schemas.microsoft.com/office/word/2010/wordprocessingCanvas" xmlns:cx="http://schemas.microsoft.com/office/drawing/2014/chartex" xmlns:cx1="http://schemas.microsoft.com/office/drawing/2015/9/8/chartex" xmlns:cx2="http://schemas.microsoft.com/office/drawing/2015/10/21/chartex" xmlns:cx3="http://schemas.microsoft.com/office/drawing/2016/5/9/chartex" xmlns:cx4="http://schemas.microsoft.com/office/drawing/2016/5/10/chartex" xmlns:cx5="http://schemas.microsoft.com/office/drawing/2016/5/11/chartex" xmlns:cx6="http://schemas.microsoft.com/office/drawing/2016/5/12/chartex" xmlns:cx7="http://schemas.microsoft.com/office/drawing/2016/5/13/chartex" xmlns:cx8="http://schemas.microsoft.com/office/drawing/2016/5/14/chartex" xmlns:mc="http://schemas.openxmlformats.org/markup-compatibility/2006" xmlns:aink="http://schemas.microsoft.com/office/drawing/2016/ink" xmlns:am3d="http://schemas.microsoft.com/office/drawing/2017/model3d" xmlns:o="urn:schemas-microsoft-com:office:office" xmlns:r="http://schemas.openxmlformats.org/officeDocument/2006/relationships" xmlns:m="http://schemas.openxmlformats.org/officeDocument/2006/math" xmlns:v="urn:schemas-microsoft-com:vml" xmlns:wp14="http://schemas.microsoft.com/office/word/2010/wordprocessingDrawing" xmlns:wp="http://schemas.openxmlformats.org/drawingml/2006/wordprocessingDrawing" xmlns:w10="urn:schemas-microsoft-com:office:word" xmlns:w="http://schemas.openxmlformats.org/wordprocessingml/2006/main" xmlns:w14="http://schemas.microsoft.com/office/word/2010/wordml" xmlns:w15="http://schemas.microsoft.com/office/word/2012/wordml" xmlns:w16cex="http://schemas.microsoft.com/office/word/2018/wordml/cex" xmlns:w16cid="http://schemas.microsoft.com/office/word/2016/wordml/cid" xmlns:w16="http://schemas.microsoft.com/office/word/2018/wordml" xmlns:w16sdtdh="http://schemas.microsoft.com/office/word/2020/wordml/sdtdatahash" xmlns:w16se="http://schemas.microsoft.com/office/word/2015/wordml/symex" xmlns:wpg="http://schemas.microsoft.com/office/word/2010/wordprocessingGroup" xmlns:wpi="http://schemas.microsoft.com/office/word/2010/wordprocessingInk" xmlns:wne="http://schemas.microsoft.com/office/word/2006/wordml" xmlns:wps="http://schemas.microsoft.com/office/word/2010/wordprocessingShape" mc:Ignorable="w14 w15 w16se w16cid w16 w16cex w16sdtdh wp14">
   <w:abstractNum w:abstractNumId="0" w15:restartNumberingAfterBreak="0">
     <w:nsid w:val="FFFFFF7C"/>
     <w:multiLevelType w:val="singleLevel"/>
@@ -743,38 +1256,528 @@
       </w:rPr>
     </w:lvl>
   </w:abstractNum>
-  <w:num w:numId="1" w16cid:durableId="2065635275">
+  <w:abstractNum w:abstractNumId="9" w15:restartNumberingAfterBreak="0">
+    <w:nsid w:val="1FF2470B"/>
+    <w:multiLevelType w:val="hybridMultilevel"/>
+    <w:tmpl w:val="5594A846"/>
+    <w:lvl w:ilvl="0" w:tplc="241A000F">
+      <w:start w:val="1"/>
+      <w:numFmt w:val="decimal"/>
+      <w:lvlText w:val="%1."/>
+      <w:lvlJc w:val="left"/>
+      <w:pPr>
+        <w:ind w:left="720" w:hanging="360"/>
+      </w:pPr>
+      <w:rPr>
+        <w:rFonts w:hint="default"/>
+      </w:rPr>
+    </w:lvl>
+    <w:lvl w:ilvl="1" w:tplc="241A0019" w:tentative="1">
+      <w:start w:val="1"/>
+      <w:numFmt w:val="lowerLetter"/>
+      <w:lvlText w:val="%2."/>
+      <w:lvlJc w:val="left"/>
+      <w:pPr>
+        <w:ind w:left="1440" w:hanging="360"/>
+      </w:pPr>
+    </w:lvl>
+    <w:lvl w:ilvl="2" w:tplc="241A001B" w:tentative="1">
+      <w:start w:val="1"/>
+      <w:numFmt w:val="lowerRoman"/>
+      <w:lvlText w:val="%3."/>
+      <w:lvlJc w:val="right"/>
+      <w:pPr>
+        <w:ind w:left="2160" w:hanging="180"/>
+      </w:pPr>
+    </w:lvl>
+    <w:lvl w:ilvl="3" w:tplc="241A000F" w:tentative="1">
+      <w:start w:val="1"/>
+      <w:numFmt w:val="decimal"/>
+      <w:lvlText w:val="%4."/>
+      <w:lvlJc w:val="left"/>
+      <w:pPr>
+        <w:ind w:left="2880" w:hanging="360"/>
+      </w:pPr>
+    </w:lvl>
+    <w:lvl w:ilvl="4" w:tplc="241A0019" w:tentative="1">
+      <w:start w:val="1"/>
+      <w:numFmt w:val="lowerLetter"/>
+      <w:lvlText w:val="%5."/>
+      <w:lvlJc w:val="left"/>
+      <w:pPr>
+        <w:ind w:left="3600" w:hanging="360"/>
+      </w:pPr>
+    </w:lvl>
+    <w:lvl w:ilvl="5" w:tplc="241A001B" w:tentative="1">
+      <w:start w:val="1"/>
+      <w:numFmt w:val="lowerRoman"/>
+      <w:lvlText w:val="%6."/>
+      <w:lvlJc w:val="right"/>
+      <w:pPr>
+        <w:ind w:left="4320" w:hanging="180"/>
+      </w:pPr>
+    </w:lvl>
+    <w:lvl w:ilvl="6" w:tplc="241A000F" w:tentative="1">
+      <w:start w:val="1"/>
+      <w:numFmt w:val="decimal"/>
+      <w:lvlText w:val="%7."/>
+      <w:lvlJc w:val="left"/>
+      <w:pPr>
+        <w:ind w:left="5040" w:hanging="360"/>
+      </w:pPr>
+    </w:lvl>
+    <w:lvl w:ilvl="7" w:tplc="241A0019" w:tentative="1">
+      <w:start w:val="1"/>
+      <w:numFmt w:val="lowerLetter"/>
+      <w:lvlText w:val="%8."/>
+      <w:lvlJc w:val="left"/>
+      <w:pPr>
+        <w:ind w:left="5760" w:hanging="360"/>
+      </w:pPr>
+    </w:lvl>
+    <w:lvl w:ilvl="8" w:tplc="241A001B" w:tentative="1">
+      <w:start w:val="1"/>
+      <w:numFmt w:val="lowerRoman"/>
+      <w:lvlText w:val="%9."/>
+      <w:lvlJc w:val="right"/>
+      <w:pPr>
+        <w:ind w:left="6480" w:hanging="180"/>
+      </w:pPr>
+    </w:lvl>
+  </w:abstractNum>
+  <w:abstractNum w:abstractNumId="10" w15:restartNumberingAfterBreak="0">
+    <w:nsid w:val="39BB0B30"/>
+    <w:multiLevelType w:val="hybridMultilevel"/>
+    <w:tmpl w:val="286E4BFE"/>
+    <w:lvl w:ilvl="0" w:tplc="241A000F">
+      <w:start w:val="5"/>
+      <w:numFmt w:val="decimal"/>
+      <w:lvlText w:val="%1."/>
+      <w:lvlJc w:val="left"/>
+      <w:pPr>
+        <w:ind w:left="720" w:hanging="360"/>
+      </w:pPr>
+      <w:rPr>
+        <w:rFonts w:hint="default"/>
+      </w:rPr>
+    </w:lvl>
+    <w:lvl w:ilvl="1" w:tplc="241A0019" w:tentative="1">
+      <w:start w:val="1"/>
+      <w:numFmt w:val="lowerLetter"/>
+      <w:lvlText w:val="%2."/>
+      <w:lvlJc w:val="left"/>
+      <w:pPr>
+        <w:ind w:left="1440" w:hanging="360"/>
+      </w:pPr>
+    </w:lvl>
+    <w:lvl w:ilvl="2" w:tplc="241A001B" w:tentative="1">
+      <w:start w:val="1"/>
+      <w:numFmt w:val="lowerRoman"/>
+      <w:lvlText w:val="%3."/>
+      <w:lvlJc w:val="right"/>
+      <w:pPr>
+        <w:ind w:left="2160" w:hanging="180"/>
+      </w:pPr>
+    </w:lvl>
+    <w:lvl w:ilvl="3" w:tplc="241A000F" w:tentative="1">
+      <w:start w:val="1"/>
+      <w:numFmt w:val="decimal"/>
+      <w:lvlText w:val="%4."/>
+      <w:lvlJc w:val="left"/>
+      <w:pPr>
+        <w:ind w:left="2880" w:hanging="360"/>
+      </w:pPr>
+    </w:lvl>
+    <w:lvl w:ilvl="4" w:tplc="241A0019" w:tentative="1">
+      <w:start w:val="1"/>
+      <w:numFmt w:val="lowerLetter"/>
+      <w:lvlText w:val="%5."/>
+      <w:lvlJc w:val="left"/>
+      <w:pPr>
+        <w:ind w:left="3600" w:hanging="360"/>
+      </w:pPr>
+    </w:lvl>
+    <w:lvl w:ilvl="5" w:tplc="241A001B" w:tentative="1">
+      <w:start w:val="1"/>
+      <w:numFmt w:val="lowerRoman"/>
+      <w:lvlText w:val="%6."/>
+      <w:lvlJc w:val="right"/>
+      <w:pPr>
+        <w:ind w:left="4320" w:hanging="180"/>
+      </w:pPr>
+    </w:lvl>
+    <w:lvl w:ilvl="6" w:tplc="241A000F" w:tentative="1">
+      <w:start w:val="1"/>
+      <w:numFmt w:val="decimal"/>
+      <w:lvlText w:val="%7."/>
+      <w:lvlJc w:val="left"/>
+      <w:pPr>
+        <w:ind w:left="5040" w:hanging="360"/>
+      </w:pPr>
+    </w:lvl>
+    <w:lvl w:ilvl="7" w:tplc="241A0019" w:tentative="1">
+      <w:start w:val="1"/>
+      <w:numFmt w:val="lowerLetter"/>
+      <w:lvlText w:val="%8."/>
+      <w:lvlJc w:val="left"/>
+      <w:pPr>
+        <w:ind w:left="5760" w:hanging="360"/>
+      </w:pPr>
+    </w:lvl>
+    <w:lvl w:ilvl="8" w:tplc="241A001B" w:tentative="1">
+      <w:start w:val="1"/>
+      <w:numFmt w:val="lowerRoman"/>
+      <w:lvlText w:val="%9."/>
+      <w:lvlJc w:val="right"/>
+      <w:pPr>
+        <w:ind w:left="6480" w:hanging="180"/>
+      </w:pPr>
+    </w:lvl>
+  </w:abstractNum>
+  <w:abstractNum w:abstractNumId="11" w15:restartNumberingAfterBreak="0">
+    <w:nsid w:val="3D2D1537"/>
+    <w:multiLevelType w:val="hybridMultilevel"/>
+    <w:tmpl w:val="FAFE6492"/>
+    <w:lvl w:ilvl="0" w:tplc="241A000F">
+      <w:start w:val="1"/>
+      <w:numFmt w:val="decimal"/>
+      <w:lvlText w:val="%1."/>
+      <w:lvlJc w:val="left"/>
+      <w:pPr>
+        <w:ind w:left="720" w:hanging="360"/>
+      </w:pPr>
+      <w:rPr>
+        <w:rFonts w:hint="default"/>
+      </w:rPr>
+    </w:lvl>
+    <w:lvl w:ilvl="1" w:tplc="241A0019" w:tentative="1">
+      <w:start w:val="1"/>
+      <w:numFmt w:val="lowerLetter"/>
+      <w:lvlText w:val="%2."/>
+      <w:lvlJc w:val="left"/>
+      <w:pPr>
+        <w:ind w:left="1440" w:hanging="360"/>
+      </w:pPr>
+    </w:lvl>
+    <w:lvl w:ilvl="2" w:tplc="241A001B" w:tentative="1">
+      <w:start w:val="1"/>
+      <w:numFmt w:val="lowerRoman"/>
+      <w:lvlText w:val="%3."/>
+      <w:lvlJc w:val="right"/>
+      <w:pPr>
+        <w:ind w:left="2160" w:hanging="180"/>
+      </w:pPr>
+    </w:lvl>
+    <w:lvl w:ilvl="3" w:tplc="241A000F" w:tentative="1">
+      <w:start w:val="1"/>
+      <w:numFmt w:val="decimal"/>
+      <w:lvlText w:val="%4."/>
+      <w:lvlJc w:val="left"/>
+      <w:pPr>
+        <w:ind w:left="2880" w:hanging="360"/>
+      </w:pPr>
+    </w:lvl>
+    <w:lvl w:ilvl="4" w:tplc="241A0019" w:tentative="1">
+      <w:start w:val="1"/>
+      <w:numFmt w:val="lowerLetter"/>
+      <w:lvlText w:val="%5."/>
+      <w:lvlJc w:val="left"/>
+      <w:pPr>
+        <w:ind w:left="3600" w:hanging="360"/>
+      </w:pPr>
+    </w:lvl>
+    <w:lvl w:ilvl="5" w:tplc="241A001B" w:tentative="1">
+      <w:start w:val="1"/>
+      <w:numFmt w:val="lowerRoman"/>
+      <w:lvlText w:val="%6."/>
+      <w:lvlJc w:val="right"/>
+      <w:pPr>
+        <w:ind w:left="4320" w:hanging="180"/>
+      </w:pPr>
+    </w:lvl>
+    <w:lvl w:ilvl="6" w:tplc="241A000F" w:tentative="1">
+      <w:start w:val="1"/>
+      <w:numFmt w:val="decimal"/>
+      <w:lvlText w:val="%7."/>
+      <w:lvlJc w:val="left"/>
+      <w:pPr>
+        <w:ind w:left="5040" w:hanging="360"/>
+      </w:pPr>
+    </w:lvl>
+    <w:lvl w:ilvl="7" w:tplc="241A0019" w:tentative="1">
+      <w:start w:val="1"/>
+      <w:numFmt w:val="lowerLetter"/>
+      <w:lvlText w:val="%8."/>
+      <w:lvlJc w:val="left"/>
+      <w:pPr>
+        <w:ind w:left="5760" w:hanging="360"/>
+      </w:pPr>
+    </w:lvl>
+    <w:lvl w:ilvl="8" w:tplc="241A001B" w:tentative="1">
+      <w:start w:val="1"/>
+      <w:numFmt w:val="lowerRoman"/>
+      <w:lvlText w:val="%9."/>
+      <w:lvlJc w:val="right"/>
+      <w:pPr>
+        <w:ind w:left="6480" w:hanging="180"/>
+      </w:pPr>
+    </w:lvl>
+  </w:abstractNum>
+  <w:abstractNum w:abstractNumId="12" w15:restartNumberingAfterBreak="0">
+    <w:nsid w:val="411A5138"/>
+    <w:multiLevelType w:val="hybridMultilevel"/>
+    <w:tmpl w:val="D0140E82"/>
+    <w:lvl w:ilvl="0" w:tplc="241A000F">
+      <w:start w:val="6"/>
+      <w:numFmt w:val="decimal"/>
+      <w:lvlText w:val="%1."/>
+      <w:lvlJc w:val="left"/>
+      <w:pPr>
+        <w:ind w:left="720" w:hanging="360"/>
+      </w:pPr>
+      <w:rPr>
+        <w:rFonts w:hint="default"/>
+      </w:rPr>
+    </w:lvl>
+    <w:lvl w:ilvl="1" w:tplc="241A0019" w:tentative="1">
+      <w:start w:val="1"/>
+      <w:numFmt w:val="lowerLetter"/>
+      <w:lvlText w:val="%2."/>
+      <w:lvlJc w:val="left"/>
+      <w:pPr>
+        <w:ind w:left="1440" w:hanging="360"/>
+      </w:pPr>
+    </w:lvl>
+    <w:lvl w:ilvl="2" w:tplc="241A001B" w:tentative="1">
+      <w:start w:val="1"/>
+      <w:numFmt w:val="lowerRoman"/>
+      <w:lvlText w:val="%3."/>
+      <w:lvlJc w:val="right"/>
+      <w:pPr>
+        <w:ind w:left="2160" w:hanging="180"/>
+      </w:pPr>
+    </w:lvl>
+    <w:lvl w:ilvl="3" w:tplc="241A000F" w:tentative="1">
+      <w:start w:val="1"/>
+      <w:numFmt w:val="decimal"/>
+      <w:lvlText w:val="%4."/>
+      <w:lvlJc w:val="left"/>
+      <w:pPr>
+        <w:ind w:left="2880" w:hanging="360"/>
+      </w:pPr>
+    </w:lvl>
+    <w:lvl w:ilvl="4" w:tplc="241A0019" w:tentative="1">
+      <w:start w:val="1"/>
+      <w:numFmt w:val="lowerLetter"/>
+      <w:lvlText w:val="%5."/>
+      <w:lvlJc w:val="left"/>
+      <w:pPr>
+        <w:ind w:left="3600" w:hanging="360"/>
+      </w:pPr>
+    </w:lvl>
+    <w:lvl w:ilvl="5" w:tplc="241A001B" w:tentative="1">
+      <w:start w:val="1"/>
+      <w:numFmt w:val="lowerRoman"/>
+      <w:lvlText w:val="%6."/>
+      <w:lvlJc w:val="right"/>
+      <w:pPr>
+        <w:ind w:left="4320" w:hanging="180"/>
+      </w:pPr>
+    </w:lvl>
+    <w:lvl w:ilvl="6" w:tplc="241A000F" w:tentative="1">
+      <w:start w:val="1"/>
+      <w:numFmt w:val="decimal"/>
+      <w:lvlText w:val="%7."/>
+      <w:lvlJc w:val="left"/>
+      <w:pPr>
+        <w:ind w:left="5040" w:hanging="360"/>
+      </w:pPr>
+    </w:lvl>
+    <w:lvl w:ilvl="7" w:tplc="241A0019" w:tentative="1">
+      <w:start w:val="1"/>
+      <w:numFmt w:val="lowerLetter"/>
+      <w:lvlText w:val="%8."/>
+      <w:lvlJc w:val="left"/>
+      <w:pPr>
+        <w:ind w:left="5760" w:hanging="360"/>
+      </w:pPr>
+    </w:lvl>
+    <w:lvl w:ilvl="8" w:tplc="241A001B" w:tentative="1">
+      <w:start w:val="1"/>
+      <w:numFmt w:val="lowerRoman"/>
+      <w:lvlText w:val="%9."/>
+      <w:lvlJc w:val="right"/>
+      <w:pPr>
+        <w:ind w:left="6480" w:hanging="180"/>
+      </w:pPr>
+    </w:lvl>
+  </w:abstractNum>
+  <w:abstractNum w:abstractNumId="13" w15:restartNumberingAfterBreak="0">
+    <w:nsid w:val="7E2104CF"/>
+    <w:multiLevelType w:val="multilevel"/>
+    <w:tmpl w:val="60E0E5DE"/>
+    <w:lvl w:ilvl="0">
+      <w:start w:val="2"/>
+      <w:numFmt w:val="decimal"/>
+      <w:lvlText w:val="%1"/>
+      <w:lvlJc w:val="left"/>
+      <w:pPr>
+        <w:ind w:left="480" w:hanging="480"/>
+      </w:pPr>
+      <w:rPr>
+        <w:rFonts w:ascii="Times New Roman" w:hAnsi="Times New Roman" w:hint="default"/>
+      </w:rPr>
+    </w:lvl>
+    <w:lvl w:ilvl="1">
+      <w:start w:val="2"/>
+      <w:numFmt w:val="decimal"/>
+      <w:lvlText w:val="%1.%2"/>
+      <w:lvlJc w:val="left"/>
+      <w:pPr>
+        <w:ind w:left="480" w:hanging="480"/>
+      </w:pPr>
+      <w:rPr>
+        <w:rFonts w:ascii="Times New Roman" w:hAnsi="Times New Roman" w:hint="default"/>
+      </w:rPr>
+    </w:lvl>
+    <w:lvl w:ilvl="2">
+      <w:start w:val="2"/>
+      <w:numFmt w:val="decimal"/>
+      <w:lvlText w:val="%1.%2.%3"/>
+      <w:lvlJc w:val="left"/>
+      <w:pPr>
+        <w:ind w:left="720" w:hanging="720"/>
+      </w:pPr>
+      <w:rPr>
+        <w:rFonts w:ascii="Times New Roman" w:hAnsi="Times New Roman" w:hint="default"/>
+      </w:rPr>
+    </w:lvl>
+    <w:lvl w:ilvl="3">
+      <w:start w:val="1"/>
+      <w:numFmt w:val="decimal"/>
+      <w:lvlText w:val="%1.%2.%3.%4"/>
+      <w:lvlJc w:val="left"/>
+      <w:pPr>
+        <w:ind w:left="720" w:hanging="720"/>
+      </w:pPr>
+      <w:rPr>
+        <w:rFonts w:ascii="Times New Roman" w:hAnsi="Times New Roman" w:hint="default"/>
+      </w:rPr>
+    </w:lvl>
+    <w:lvl w:ilvl="4">
+      <w:start w:val="1"/>
+      <w:numFmt w:val="decimal"/>
+      <w:lvlText w:val="%1.%2.%3.%4.%5"/>
+      <w:lvlJc w:val="left"/>
+      <w:pPr>
+        <w:ind w:left="1080" w:hanging="1080"/>
+      </w:pPr>
+      <w:rPr>
+        <w:rFonts w:ascii="Times New Roman" w:hAnsi="Times New Roman" w:hint="default"/>
+      </w:rPr>
+    </w:lvl>
+    <w:lvl w:ilvl="5">
+      <w:start w:val="1"/>
+      <w:numFmt w:val="decimal"/>
+      <w:lvlText w:val="%1.%2.%3.%4.%5.%6"/>
+      <w:lvlJc w:val="left"/>
+      <w:pPr>
+        <w:ind w:left="1080" w:hanging="1080"/>
+      </w:pPr>
+      <w:rPr>
+        <w:rFonts w:ascii="Times New Roman" w:hAnsi="Times New Roman" w:hint="default"/>
+      </w:rPr>
+    </w:lvl>
+    <w:lvl w:ilvl="6">
+      <w:start w:val="1"/>
+      <w:numFmt w:val="decimal"/>
+      <w:lvlText w:val="%1.%2.%3.%4.%5.%6.%7"/>
+      <w:lvlJc w:val="left"/>
+      <w:pPr>
+        <w:ind w:left="1440" w:hanging="1440"/>
+      </w:pPr>
+      <w:rPr>
+        <w:rFonts w:ascii="Times New Roman" w:hAnsi="Times New Roman" w:hint="default"/>
+      </w:rPr>
+    </w:lvl>
+    <w:lvl w:ilvl="7">
+      <w:start w:val="1"/>
+      <w:numFmt w:val="decimal"/>
+      <w:lvlText w:val="%1.%2.%3.%4.%5.%6.%7.%8"/>
+      <w:lvlJc w:val="left"/>
+      <w:pPr>
+        <w:ind w:left="1440" w:hanging="1440"/>
+      </w:pPr>
+      <w:rPr>
+        <w:rFonts w:ascii="Times New Roman" w:hAnsi="Times New Roman" w:hint="default"/>
+      </w:rPr>
+    </w:lvl>
+    <w:lvl w:ilvl="8">
+      <w:start w:val="1"/>
+      <w:numFmt w:val="decimal"/>
+      <w:lvlText w:val="%1.%2.%3.%4.%5.%6.%7.%8.%9"/>
+      <w:lvlJc w:val="left"/>
+      <w:pPr>
+        <w:ind w:left="1800" w:hanging="1800"/>
+      </w:pPr>
+      <w:rPr>
+        <w:rFonts w:ascii="Times New Roman" w:hAnsi="Times New Roman" w:hint="default"/>
+      </w:rPr>
+    </w:lvl>
+  </w:abstractNum>
+  <w:num w:numId="1">
     <w:abstractNumId w:val="8"/>
   </w:num>
-  <w:num w:numId="2" w16cid:durableId="77139238">
+  <w:num w:numId="2">
     <w:abstractNumId w:val="6"/>
   </w:num>
-  <w:num w:numId="3" w16cid:durableId="1648970204">
+  <w:num w:numId="3">
     <w:abstractNumId w:val="5"/>
   </w:num>
-  <w:num w:numId="4" w16cid:durableId="1130978858">
+  <w:num w:numId="4">
     <w:abstractNumId w:val="4"/>
   </w:num>
-  <w:num w:numId="5" w16cid:durableId="43452752">
+  <w:num w:numId="5">
     <w:abstractNumId w:val="7"/>
   </w:num>
-  <w:num w:numId="6" w16cid:durableId="1887332189">
+  <w:num w:numId="6">
     <w:abstractNumId w:val="3"/>
   </w:num>
-  <w:num w:numId="7" w16cid:durableId="887229201">
+  <w:num w:numId="7">
     <w:abstractNumId w:val="2"/>
   </w:num>
-  <w:num w:numId="8" w16cid:durableId="50663482">
+  <w:num w:numId="8">
     <w:abstractNumId w:val="1"/>
   </w:num>
-  <w:num w:numId="9" w16cid:durableId="499974511">
+  <w:num w:numId="9">
     <w:abstractNumId w:val="0"/>
+  </w:num>
+  <w:num w:numId="10">
+    <w:abstractNumId w:val="13"/>
+  </w:num>
+  <w:num w:numId="11">
+    <w:abstractNumId w:val="7"/>
+    <w:lvlOverride w:ilvl="0">
+      <w:startOverride w:val="7"/>
+    </w:lvlOverride>
+  </w:num>
+  <w:num w:numId="12">
+    <w:abstractNumId w:val="11"/>
+  </w:num>
+  <w:num w:numId="13">
+    <w:abstractNumId w:val="10"/>
+  </w:num>
+  <w:num w:numId="14">
+    <w:abstractNumId w:val="9"/>
+  </w:num>
+  <w:num w:numId="15">
+    <w:abstractNumId w:val="12"/>
   </w:num>
 </w:numbering>
 </file>
 
 <file path=word/styles.xml><?xml version="1.0" encoding="utf-8"?>
-<w:styles xmlns:mc="http://schemas.openxmlformats.org/markup-compatibility/2006" xmlns:r="http://schemas.openxmlformats.org/officeDocument/2006/relationships" xmlns:w="http://schemas.openxmlformats.org/wordprocessingml/2006/main" xmlns:w14="http://schemas.microsoft.com/office/word/2010/wordml" xmlns:w15="http://schemas.microsoft.com/office/word/2012/wordml" xmlns:w16cex="http://schemas.microsoft.com/office/word/2018/wordml/cex" xmlns:w16cid="http://schemas.microsoft.com/office/word/2016/wordml/cid" xmlns:w16="http://schemas.microsoft.com/office/word/2018/wordml" xmlns:w16du="http://schemas.microsoft.com/office/word/2023/wordml/word16du" xmlns:w16sdtdh="http://schemas.microsoft.com/office/word/2020/wordml/sdtdatahash" xmlns:w16sdtfl="http://schemas.microsoft.com/office/word/2024/wordml/sdtformatlock" xmlns:w16se="http://schemas.microsoft.com/office/word/2015/wordml/symex" mc:Ignorable="w14 w15 w16se w16cid w16 w16cex w16sdtdh w16sdtfl w16du">
+<w:styles xmlns:mc="http://schemas.openxmlformats.org/markup-compatibility/2006" xmlns:r="http://schemas.openxmlformats.org/officeDocument/2006/relationships" xmlns:w="http://schemas.openxmlformats.org/wordprocessingml/2006/main" xmlns:w14="http://schemas.microsoft.com/office/word/2010/wordml" xmlns:w15="http://schemas.microsoft.com/office/word/2012/wordml" xmlns:w16cex="http://schemas.microsoft.com/office/word/2018/wordml/cex" xmlns:w16cid="http://schemas.microsoft.com/office/word/2016/wordml/cid" xmlns:w16="http://schemas.microsoft.com/office/word/2018/wordml" xmlns:w16sdtdh="http://schemas.microsoft.com/office/word/2020/wordml/sdtdatahash" xmlns:w16se="http://schemas.microsoft.com/office/word/2015/wordml/symex" mc:Ignorable="w14 w15 w16se w16cid w16 w16cex w16sdtdh">
   <w:docDefaults>
     <w:rPrDefault>
       <w:rPr>

</xml_diff>